<commit_message>
Add QBE Insurance application and update source of truth files
- QBE resume tailored for Data & AI Strategy and Value Assurance, Senior Manager role
- Job ad saved as .docx in application folder
- Resume_Master.docx: added 8 new AoE phrasings, merged Data Viz into Analytics & Data Platforms
- Skills_Gap_Analysis.xlsx: added QBE column (68% strong match), 3 new gaps identified
</commit_message>
<xml_diff>
--- a/Resume_Master.docx
+++ b/Resume_Master.docx
@@ -111,6 +111,66 @@
       </w:r>
       <w:r>
         <w:rPr>
+          <w:rFonts w:ascii="Wingdings" w:hAnsi="Wingdings"/>
+          <w:sz w:val="28"/>
+          <w:color w:val="1D4575"/>
+        </w:rPr>
+        <w:t xml:space="preserve"> l </w:t>
+      </w:r>
+      <w:r>
+        <w:rPr>
+          <w:rFonts w:ascii="Calibri" w:hAnsi="Calibri"/>
+          <w:sz w:val="28"/>
+        </w:rPr>
+        <w:t xml:space="preserve">Value Realisation &amp; Strategy Implementation</w:t>
+      </w:r>
+      <w:r>
+        <w:rPr>
+          <w:rFonts w:ascii="Wingdings" w:hAnsi="Wingdings"/>
+          <w:sz w:val="28"/>
+          <w:color w:val="1D4575"/>
+        </w:rPr>
+        <w:t xml:space="preserve"> l </w:t>
+      </w:r>
+      <w:r>
+        <w:rPr>
+          <w:rFonts w:ascii="Calibri" w:hAnsi="Calibri"/>
+          <w:sz w:val="28"/>
+        </w:rPr>
+        <w:t xml:space="preserve">Strategic Portfolio Management</w:t>
+      </w:r>
+      <w:r>
+        <w:rPr>
+          <w:rFonts w:ascii="Wingdings" w:hAnsi="Wingdings"/>
+          <w:sz w:val="28"/>
+          <w:color w:val="1D4575"/>
+        </w:rPr>
+        <w:t xml:space="preserve"> l </w:t>
+      </w:r>
+      <w:r>
+        <w:rPr>
+          <w:rFonts w:ascii="Calibri" w:hAnsi="Calibri"/>
+          <w:sz w:val="28"/>
+        </w:rPr>
+        <w:t xml:space="preserve">Business Case Development</w:t>
+      </w:r>
+      <w:r>
+        <w:rPr>
+          <w:rFonts w:ascii="Wingdings" w:hAnsi="Wingdings"/>
+          <w:sz w:val="28"/>
+          <w:color w:val="1D4575"/>
+        </w:rPr>
+        <w:t xml:space="preserve"> l </w:t>
+      </w:r>
+      <w:r>
+        <w:rPr>
+          <w:rFonts w:ascii="Calibri" w:hAnsi="Calibri"/>
+          <w:sz w:val="28"/>
+        </w:rPr>
+        <w:t xml:space="preserve">Strategic Planning</w:t>
+      </w:r>
+      <w:r>
+        <w:rPr>
           <w:rFonts w:ascii="Wingdings"/>
           <w:color w:val="1D4575"/>
           <w:sz w:val="20"/>
@@ -126,6 +186,21 @@
       </w:r>
       <w:r>
         <w:rPr>
+          <w:rFonts w:ascii="Wingdings" w:hAnsi="Wingdings"/>
+          <w:sz w:val="28"/>
+          <w:color w:val="1D4575"/>
+        </w:rPr>
+        <w:t xml:space="preserve"> l </w:t>
+      </w:r>
+      <w:r>
+        <w:rPr>
+          <w:rFonts w:ascii="Calibri" w:hAnsi="Calibri"/>
+          <w:sz w:val="28"/>
+        </w:rPr>
+        <w:t xml:space="preserve">Navigating Ambiguity in Matrixed Organisations</w:t>
+      </w:r>
+      <w:r>
+        <w:rPr>
           <w:rFonts w:ascii="Wingdings"/>
           <w:color w:val="1D4575"/>
           <w:sz w:val="20"/>
@@ -351,6 +426,21 @@
       </w:r>
       <w:r>
         <w:rPr>
+          <w:rFonts w:ascii="Wingdings" w:hAnsi="Wingdings"/>
+          <w:sz w:val="28"/>
+          <w:color w:val="1D4575"/>
+        </w:rPr>
+        <w:t xml:space="preserve"> l </w:t>
+      </w:r>
+      <w:r>
+        <w:rPr>
+          <w:rFonts w:ascii="Calibri" w:hAnsi="Calibri"/>
+          <w:sz w:val="28"/>
+        </w:rPr>
+        <w:t xml:space="preserve">Stakeholder Management &amp; Influencing Without Formal Authority</w:t>
+      </w:r>
+      <w:r>
+        <w:rPr>
           <w:rFonts w:ascii="Wingdings"/>
           <w:color w:val="1D4575"/>
           <w:sz w:val="20"/>
@@ -411,6 +501,21 @@
       </w:r>
       <w:r>
         <w:rPr>
+          <w:rFonts w:ascii="Wingdings" w:hAnsi="Wingdings"/>
+          <w:sz w:val="28"/>
+          <w:color w:val="1D4575"/>
+        </w:rPr>
+        <w:t xml:space="preserve"> l </w:t>
+      </w:r>
+      <w:r>
+        <w:rPr>
+          <w:rFonts w:ascii="Calibri" w:hAnsi="Calibri"/>
+          <w:sz w:val="28"/>
+        </w:rPr>
+        <w:t xml:space="preserve">Risk Management</w:t>
+      </w:r>
+      <w:r>
+        <w:rPr>
           <w:rFonts w:ascii="Wingdings"/>
           <w:color w:val="1D4575"/>
           <w:sz w:val="20"/>
@@ -453,6 +558,21 @@
           <w:sz w:val="20"/>
         </w:rPr>
         <w:t>Gen AI / LLMs | Claude Code | GitHub Copilot</w:t>
+      </w:r>
+      <w:r>
+        <w:rPr>
+          <w:rFonts w:ascii="Wingdings" w:hAnsi="Wingdings"/>
+          <w:sz w:val="28"/>
+          <w:color w:val="1D4575"/>
+        </w:rPr>
+        <w:t xml:space="preserve"> l </w:t>
+      </w:r>
+      <w:r>
+        <w:rPr>
+          <w:rFonts w:ascii="Calibri" w:hAnsi="Calibri"/>
+          <w:sz w:val="28"/>
+        </w:rPr>
+        <w:t xml:space="preserve">Consulting &amp; Industry Expertise</w:t>
       </w:r>
     </w:p>
     <w:p>
@@ -1659,34 +1779,11 @@
           <w:tcPr>
             <w:tcW w:w="2448" w:type="dxa"/>
           </w:tcPr>
-          <w:p>
-            <w:pPr>
-              <w:spacing w:line="269" w:lineRule="auto"/>
-            </w:pPr>
-            <w:r>
-              <w:rPr>
-                <w:b/>
-                <w:sz w:val="20"/>
-              </w:rPr>
-              <w:t>Data Viz &amp; Reporting</w:t>
-            </w:r>
-          </w:p>
         </w:tc>
         <w:tc>
           <w:tcPr>
             <w:tcW w:w="8141" w:type="dxa"/>
           </w:tcPr>
-          <w:p>
-            <w:pPr>
-              <w:spacing w:line="269" w:lineRule="auto"/>
-            </w:pPr>
-            <w:r>
-              <w:rPr>
-                <w:sz w:val="20"/>
-              </w:rPr>
-              <w:t>Power BI, Tableau</w:t>
-            </w:r>
-          </w:p>
         </w:tc>
       </w:tr>
       <w:tr>
@@ -1703,7 +1800,7 @@
                 <w:b/>
                 <w:sz w:val="20"/>
               </w:rPr>
-              <w:t>Analytics, Data Science &amp; Platforms</w:t>
+              <w:t>Analytics, Data Platforms &amp; Visualisation</w:t>
             </w:r>
           </w:p>
         </w:tc>
@@ -1719,7 +1816,7 @@
               <w:rPr>
                 <w:sz w:val="20"/>
               </w:rPr>
-              <w:t>Python, SQL, Alteryx, Dataiku, Data Warehouse, Hadoop Data Lake</w:t>
+              <w:t>Python, SQL, Alteryx, Dataiku, Data Warehouse, Hadoop Data Lake, Power BI, Tableau</w:t>
             </w:r>
           </w:p>
         </w:tc>

</xml_diff>